<commit_message>
Digest #5 went out — ledger corrected, and #6 loses a stale question
Adam confirms #5 was sent. The ledger said drafted, which is why #6 was
asking leadership whether it had arrived. Both fixed: the ledger records
it as sent, and the question is gone from #6 rather than left in to be
answered by three people who already have the thing.

Rebuilt the .docx so what goes out matches.
</commit_message>
<xml_diff>
--- a/docs/digests/Translation Tool - Daily Digest #6 - 20260913.docx
+++ b/docs/digests/Translation Tool - Daily Digest #6 - 20260913.docx
@@ -1109,34 +1109,6 @@
       </w:r>
       <w:r>
         <w:t xml:space="preserve">it.</w:t>
-      </w:r>
-    </w:p>
-    <w:p>
-      <w:pPr>
-        <w:pStyle w:val="Compact"/>
-        <w:numPr>
-          <w:ilvl w:val="0"/>
-          <w:numId w:val="1003"/>
-        </w:numPr>
-      </w:pPr>
-      <w:r>
-        <w:rPr>
-          <w:b/>
-          <w:bCs/>
-        </w:rPr>
-        <w:t xml:space="preserve">Yesterday’s digest</w:t>
-      </w:r>
-      <w:r>
-        <w:t xml:space="preserve"> </w:t>
-      </w:r>
-      <w:r>
-        <w:t xml:space="preserve">shows in my records as drafted but not sent. If it</w:t>
-      </w:r>
-      <w:r>
-        <w:t xml:space="preserve"> </w:t>
-      </w:r>
-      <w:r>
-        <w:t xml:space="preserve">did not reach you, say so and I will send it.</w:t>
       </w:r>
     </w:p>
     <w:bookmarkEnd w:id="18"/>

</xml_diff>